<commit_message>
Cơ cấu mới FTU (bỏ Bộ môn): Khoa phụ trách, Trường/Khoa, khối ký Trưởng Khoa | Hiệu trưởng; nhãn/chức danh cũ = lỗi; sinh file + fixture + hướng dẫn theo quy tắc mới (v1.4)
Co-Authored-By: Claude Fable 5.1 <noreply@anthropic.com>
Claude-Session: https://claude.ai/code/session_01J5hFTnC5V9k15HPt9qZKTz
</commit_message>
<xml_diff>
--- a/tests/fixtures/chuan_en.docx
+++ b/tests/fixtures/chuan_en.docx
@@ -150,14 +150,14 @@
           <w:sz w:val="26"/>
           <w:szCs w:val="26"/>
         </w:rPr>
-        <w:t xml:space="preserve">Department:</w:t>
+        <w:t xml:space="preserve">Faculty in charge:</w:t>
       </w:r>
       <w:r>
         <w:rPr>
           <w:sz w:val="26"/>
           <w:szCs w:val="26"/>
         </w:rPr>
-        <w:t xml:space="preserve"> Kinh tế và Quản lý</w:t>
+        <w:t xml:space="preserve"> Faculty of Economics and Interdisciplinary Management</w:t>
       </w:r>
     </w:p>
     <w:p>
@@ -181,7 +181,7 @@
           <w:sz w:val="26"/>
           <w:szCs w:val="26"/>
         </w:rPr>
-        <w:t xml:space="preserve"> Viện Kinh tế và Kinh doanh quốc tế</w:t>
+        <w:t xml:space="preserve"> School of Economics and Public Management</w:t>
       </w:r>
     </w:p>
     <w:p>
@@ -229,7 +229,7 @@
           <w:sz w:val="26"/>
           <w:szCs w:val="26"/>
         </w:rPr>
-        <w:t xml:space="preserve"> Không</w:t>
+        <w:t xml:space="preserve"> None</w:t>
       </w:r>
     </w:p>
     <w:p>
@@ -9515,7 +9515,7 @@
           <w:sz w:val="26"/>
           <w:szCs w:val="26"/>
         </w:rPr>
-        <w:t xml:space="preserve">Note: Practical activities and assessment methods may be adjusted according to actual conditions and the decision of the Department.</w:t>
+        <w:t xml:space="preserve">Note: Practical activities and assessment methods may be adjusted according to actual conditions and the decision of the Faculty.</w:t>
       </w:r>
     </w:p>
     <w:p>
@@ -10478,7 +10478,7 @@
                 <w:sz w:val="24"/>
                 <w:szCs w:val="24"/>
               </w:rPr>
-              <w:t xml:space="preserve">HEAD OF DEPARTMENT</w:t>
+              <w:t xml:space="preserve">DEAN OF FACULTY</w:t>
             </w:r>
           </w:p>
           <w:p>
@@ -10544,7 +10544,7 @@
                 <w:sz w:val="24"/>
                 <w:szCs w:val="24"/>
               </w:rPr>
-              <w:t xml:space="preserve">DEAN OF SCHOOL OF ECONOMICS AND INTERNATIONAL BUSINESS</w:t>
+              <w:t xml:space="preserve">PRESIDENT</w:t>
             </w:r>
           </w:p>
           <w:p>

</xml_diff>

<commit_message>
v1.5: EN giữ Department/Faculty-College + HEAD OF DEPARTMENT | DEAN; đề cương đặc thù chỉ Hiệu trưởng/Dean; cơ cấu 4 trường thuộc trong hướng dẫn; fixture mới
Co-Authored-By: Claude Fable 5.1 <noreply@anthropic.com>
Claude-Session: https://claude.ai/code/session_01J5hFTnC5V9k15HPt9qZKTz
</commit_message>
<xml_diff>
--- a/tests/fixtures/chuan_en.docx
+++ b/tests/fixtures/chuan_en.docx
@@ -150,14 +150,14 @@
           <w:sz w:val="26"/>
           <w:szCs w:val="26"/>
         </w:rPr>
-        <w:t xml:space="preserve">Faculty in charge:</w:t>
+        <w:t xml:space="preserve">Department:</w:t>
       </w:r>
       <w:r>
         <w:rPr>
           <w:sz w:val="26"/>
           <w:szCs w:val="26"/>
         </w:rPr>
-        <w:t xml:space="preserve"> Faculty of Economics and Interdisciplinary Management</w:t>
+        <w:t xml:space="preserve"> Department of Economics and Interdisciplinary Management</w:t>
       </w:r>
     </w:p>
     <w:p>
@@ -174,14 +174,14 @@
           <w:sz w:val="26"/>
           <w:szCs w:val="26"/>
         </w:rPr>
-        <w:t xml:space="preserve">School:</w:t>
+        <w:t xml:space="preserve">College:</w:t>
       </w:r>
       <w:r>
         <w:rPr>
           <w:sz w:val="26"/>
           <w:szCs w:val="26"/>
         </w:rPr>
-        <w:t xml:space="preserve"> School of Economics and Public Management</w:t>
+        <w:t xml:space="preserve"> College of Economics and Public Management</w:t>
       </w:r>
     </w:p>
     <w:p>
@@ -9515,7 +9515,7 @@
           <w:sz w:val="26"/>
           <w:szCs w:val="26"/>
         </w:rPr>
-        <w:t xml:space="preserve">Note: Practical activities and assessment methods may be adjusted according to actual conditions and the decision of the Faculty.</w:t>
+        <w:t xml:space="preserve">Note: Practical activities and assessment methods may be adjusted according to actual conditions and the decision of the Department.</w:t>
       </w:r>
     </w:p>
     <w:p>
@@ -10478,7 +10478,7 @@
                 <w:sz w:val="24"/>
                 <w:szCs w:val="24"/>
               </w:rPr>
-              <w:t xml:space="preserve">DEAN OF FACULTY</w:t>
+              <w:t xml:space="preserve">HEAD OF DEPARTMENT</w:t>
             </w:r>
           </w:p>
           <w:p>
@@ -10544,7 +10544,7 @@
                 <w:sz w:val="24"/>
                 <w:szCs w:val="24"/>
               </w:rPr>
-              <w:t xml:space="preserve">PRESIDENT</w:t>
+              <w:t xml:space="preserve">DEAN</w:t>
             </w:r>
           </w:p>
           <w:p>

</xml_diff>

<commit_message>
v1.8: dòng Kiểm tra, đánh giá = hình thức đánh giá dùng buổi đó (ô chọn Chuyên cần/Giữa kỳ/Cuối kỳ), không giờ; bộ kiểm bắt câu hỏi ôn tập ghi nhầm
Co-Authored-By: Claude Fable 5.1 <noreply@anthropic.com>
Claude-Session: https://claude.ai/code/session_01J5hFTnC5V9k15HPt9qZKTz
</commit_message>
<xml_diff>
--- a/tests/fixtures/chuan_en.docx
+++ b/tests/fixtures/chuan_en.docx
@@ -5022,7 +5022,7 @@
                 <w:sz w:val="24"/>
                 <w:szCs w:val="24"/>
               </w:rPr>
-              <w:t xml:space="preserve"/>
+              <w:t xml:space="preserve">Attendance, Mid-term, Final exam</w:t>
             </w:r>
           </w:p>
         </w:tc>
@@ -5517,7 +5517,7 @@
                 <w:sz w:val="24"/>
                 <w:szCs w:val="24"/>
               </w:rPr>
-              <w:t xml:space="preserve"/>
+              <w:t xml:space="preserve">Attendance, Mid-term, Final exam</w:t>
             </w:r>
           </w:p>
         </w:tc>
@@ -6012,7 +6012,7 @@
                 <w:sz w:val="24"/>
                 <w:szCs w:val="24"/>
               </w:rPr>
-              <w:t xml:space="preserve"/>
+              <w:t xml:space="preserve">Attendance, Mid-term, Final exam</w:t>
             </w:r>
           </w:p>
         </w:tc>
@@ -6507,7 +6507,7 @@
                 <w:sz w:val="24"/>
                 <w:szCs w:val="24"/>
               </w:rPr>
-              <w:t xml:space="preserve"/>
+              <w:t xml:space="preserve">Attendance, Mid-term, Final exam</w:t>
             </w:r>
           </w:p>
         </w:tc>
@@ -7002,7 +7002,7 @@
                 <w:sz w:val="24"/>
                 <w:szCs w:val="24"/>
               </w:rPr>
-              <w:t xml:space="preserve"/>
+              <w:t xml:space="preserve">Attendance, Mid-term, Final exam</w:t>
             </w:r>
           </w:p>
         </w:tc>
@@ -7497,7 +7497,7 @@
                 <w:sz w:val="24"/>
                 <w:szCs w:val="24"/>
               </w:rPr>
-              <w:t xml:space="preserve"/>
+              <w:t xml:space="preserve">Attendance, Final exam</w:t>
             </w:r>
           </w:p>
         </w:tc>
@@ -7992,7 +7992,7 @@
                 <w:sz w:val="24"/>
                 <w:szCs w:val="24"/>
               </w:rPr>
-              <w:t xml:space="preserve"/>
+              <w:t xml:space="preserve">Attendance, Final exam</w:t>
             </w:r>
           </w:p>
         </w:tc>
@@ -8487,7 +8487,7 @@
                 <w:sz w:val="24"/>
                 <w:szCs w:val="24"/>
               </w:rPr>
-              <w:t xml:space="preserve"/>
+              <w:t xml:space="preserve">Attendance, Final exam</w:t>
             </w:r>
           </w:p>
         </w:tc>
@@ -8982,7 +8982,7 @@
                 <w:sz w:val="24"/>
                 <w:szCs w:val="24"/>
               </w:rPr>
-              <w:t xml:space="preserve"/>
+              <w:t xml:space="preserve">Attendance, Final exam</w:t>
             </w:r>
           </w:p>
         </w:tc>
@@ -9477,7 +9477,7 @@
                 <w:sz w:val="24"/>
                 <w:szCs w:val="24"/>
               </w:rPr>
-              <w:t xml:space="preserve"/>
+              <w:t xml:space="preserve">Attendance, Final exam</w:t>
             </w:r>
           </w:p>
         </w:tc>

</xml_diff>

<commit_message>
v2.1: ô Quy ước Khoa KTLN tự điền đơn vị và người ký ở phần 4 (VN/EN); tên người ký trong khối ký; mã học phần ddd/Hddd/Eddd/dddE suy chương trình và ngôn ngữ, báo lỗi khi lệch
Co-Authored-By: Claude Fable 5.1 <noreply@anthropic.com>
Claude-Session: https://claude.ai/code/session_01J5hFTnC5V9k15HPt9qZKTz
</commit_message>
<xml_diff>
--- a/tests/fixtures/chuan_en.docx
+++ b/tests/fixtures/chuan_en.docx
@@ -133,7 +133,7 @@
           <w:sz w:val="26"/>
           <w:szCs w:val="26"/>
         </w:rPr>
-        <w:t xml:space="preserve"> DTU301</w:t>
+        <w:t xml:space="preserve"> DTUE301</w:t>
       </w:r>
     </w:p>
     <w:p>
@@ -10526,12 +10526,6 @@
               <w:t xml:space="preserve"/>
             </w:r>
           </w:p>
-        </w:tc>
-        <w:tc>
-          <w:tcPr>
-            <w:tcW w:w="4758" w:type="dxa"/>
-            <w:vAlign w:val="top"/>
-          </w:tcPr>
           <w:p>
             <w:pPr>
               <w:spacing w:before="0" w:after="40" w:line="240" w:lineRule="auto"/>
@@ -10544,9 +10538,15 @@
                 <w:sz w:val="24"/>
                 <w:szCs w:val="24"/>
               </w:rPr>
-              <w:t xml:space="preserve">DEAN</w:t>
-            </w:r>
-          </w:p>
+              <w:t xml:space="preserve">Dr. Do Ngoc Kien</w:t>
+            </w:r>
+          </w:p>
+        </w:tc>
+        <w:tc>
+          <w:tcPr>
+            <w:tcW w:w="4758" w:type="dxa"/>
+            <w:vAlign w:val="top"/>
+          </w:tcPr>
           <w:p>
             <w:pPr>
               <w:spacing w:before="0" w:after="40" w:line="240" w:lineRule="auto"/>
@@ -10559,7 +10559,7 @@
                 <w:sz w:val="24"/>
                 <w:szCs w:val="24"/>
               </w:rPr>
-              <w:t xml:space="preserve"/>
+              <w:t xml:space="preserve">DEAN OF COLLEGE</w:t>
             </w:r>
           </w:p>
           <w:p>
@@ -10590,6 +10590,36 @@
                 <w:szCs w:val="24"/>
               </w:rPr>
               <w:t xml:space="preserve"/>
+            </w:r>
+          </w:p>
+          <w:p>
+            <w:pPr>
+              <w:spacing w:before="0" w:after="40" w:line="240" w:lineRule="auto"/>
+              <w:jc w:val="center"/>
+            </w:pPr>
+            <w:r>
+              <w:rPr>
+                <w:b/>
+                <w:bCs/>
+                <w:sz w:val="24"/>
+                <w:szCs w:val="24"/>
+              </w:rPr>
+              <w:t xml:space="preserve"/>
+            </w:r>
+          </w:p>
+          <w:p>
+            <w:pPr>
+              <w:spacing w:before="0" w:after="40" w:line="240" w:lineRule="auto"/>
+              <w:jc w:val="center"/>
+            </w:pPr>
+            <w:r>
+              <w:rPr>
+                <w:b/>
+                <w:bCs/>
+                <w:sz w:val="24"/>
+                <w:szCs w:val="24"/>
+              </w:rPr>
+              <w:t xml:space="preserve">Assoc. Prof. Dr. Bui Thi Ly</w:t>
             </w:r>
           </w:p>
         </w:tc>

</xml_diff>

<commit_message>
v2.3: bỏ ô Mục tiêu đào tạo; ma trận 3.2 dựng sẵn theo số CLO và PLO để đánh dấu
</commit_message>
<xml_diff>
--- a/tests/fixtures/chuan_en.docx
+++ b/tests/fixtures/chuan_en.docx
@@ -568,63 +568,6 @@
           <w:szCs w:val="26"/>
         </w:rPr>
         <w:t xml:space="preserve">Học phần cung cấp cho sinh viên những nguyên lý cơ bản của quản lý kinh tế ở cấp độ quốc gia: vì sao nhà nước can thiệp vào nền kinh tế, can thiệp bằng công cụ nào, và đánh giá kết quả can thiệp ra sao. Nội dung gồm bốn khối: bản chất và chức năng của quản lý kinh tế; các công cụ quản lý kinh tế vĩ mô; quản lý các thị trường và khu vực kinh tế; đánh giá hiệu lực và hiệu quả của chính sách kinh tế. Học phần kết hợp lý thuyết với các tình huống thực tế của Việt Nam để sinh viên vận dụng được khung phân tích vào các vấn đề quản lý kinh tế đương đại.</w:t>
-      </w:r>
-    </w:p>
-    <w:p>
-      <w:pPr>
-        <w:spacing w:before="0" w:after="60" w:line="276" w:lineRule="auto"/>
-        <w:jc w:val="both"/>
-      </w:pPr>
-      <w:r>
-        <w:rPr>
-          <w:b/>
-          <w:bCs/>
-          <w:sz w:val="26"/>
-          <w:szCs w:val="26"/>
-        </w:rPr>
-        <w:t xml:space="preserve">Course objectives:</w:t>
-      </w:r>
-    </w:p>
-    <w:p>
-      <w:pPr>
-        <w:spacing w:before="0" w:after="120" w:line="276" w:lineRule="auto"/>
-        <w:ind w:left="360"/>
-        <w:jc w:val="both"/>
-      </w:pPr>
-      <w:r>
-        <w:rPr>
-          <w:sz w:val="26"/>
-          <w:szCs w:val="26"/>
-        </w:rPr>
-        <w:t xml:space="preserve">(1) Trang bị khung lý thuyết về vai trò và công cụ của nhà nước trong nền kinh tế.</w:t>
-      </w:r>
-    </w:p>
-    <w:p>
-      <w:pPr>
-        <w:spacing w:before="0" w:after="120" w:line="276" w:lineRule="auto"/>
-        <w:ind w:left="360"/>
-        <w:jc w:val="both"/>
-      </w:pPr>
-      <w:r>
-        <w:rPr>
-          <w:sz w:val="26"/>
-          <w:szCs w:val="26"/>
-        </w:rPr>
-        <w:t xml:space="preserve">(2) Rèn kỹ năng phân tích một chính sách kinh tế theo mục tiêu, công cụ và kết quả.</w:t>
-      </w:r>
-    </w:p>
-    <w:p>
-      <w:pPr>
-        <w:spacing w:before="0" w:after="120" w:line="276" w:lineRule="auto"/>
-        <w:ind w:left="360"/>
-        <w:jc w:val="both"/>
-      </w:pPr>
-      <w:r>
-        <w:rPr>
-          <w:sz w:val="26"/>
-          <w:szCs w:val="26"/>
-        </w:rPr>
-        <w:t xml:space="preserve">(3) Hình thành thái độ khách quan, dựa trên bằng chứng khi đánh giá chính sách.</w:t>
       </w:r>
     </w:p>
     <w:p>

</xml_diff>

<commit_message>
v2.4: ma trận 3.2 ghi mức 1-3 kèm ',A' (chọn ở phần 4, sinh file, bộ kiểm báo lỗi 'X')
Co-Authored-By: Claude Fable 5.1 <noreply@anthropic.com>
Claude-Session: https://claude.ai/code/session_01J5hFTnC5V9k15HPt9qZKTz
</commit_message>
<xml_diff>
--- a/tests/fixtures/chuan_en.docx
+++ b/tests/fixtures/chuan_en.docx
@@ -960,7 +960,7 @@
                 <w:sz w:val="24"/>
                 <w:szCs w:val="24"/>
               </w:rPr>
-              <w:t xml:space="preserve">X</w:t>
+              <w:t xml:space="preserve">2</w:t>
             </w:r>
           </w:p>
         </w:tc>
@@ -979,7 +979,7 @@
                 <w:sz w:val="24"/>
                 <w:szCs w:val="24"/>
               </w:rPr>
-              <w:t xml:space="preserve">X</w:t>
+              <w:t xml:space="preserve">3,A</w:t>
             </w:r>
           </w:p>
         </w:tc>
@@ -1135,7 +1135,7 @@
                 <w:sz w:val="24"/>
                 <w:szCs w:val="24"/>
               </w:rPr>
-              <w:t xml:space="preserve">X</w:t>
+              <w:t xml:space="preserve">3</w:t>
             </w:r>
           </w:p>
         </w:tc>
@@ -1154,7 +1154,7 @@
                 <w:sz w:val="24"/>
                 <w:szCs w:val="24"/>
               </w:rPr>
-              <w:t xml:space="preserve">X</w:t>
+              <w:t xml:space="preserve">3,A</w:t>
             </w:r>
           </w:p>
         </w:tc>
@@ -1310,7 +1310,7 @@
                 <w:sz w:val="24"/>
                 <w:szCs w:val="24"/>
               </w:rPr>
-              <w:t xml:space="preserve">X</w:t>
+              <w:t xml:space="preserve">3</w:t>
             </w:r>
           </w:p>
         </w:tc>
@@ -1329,7 +1329,7 @@
                 <w:sz w:val="24"/>
                 <w:szCs w:val="24"/>
               </w:rPr>
-              <w:t xml:space="preserve">X</w:t>
+              <w:t xml:space="preserve">2</w:t>
             </w:r>
           </w:p>
         </w:tc>
@@ -1367,7 +1367,7 @@
                 <w:sz w:val="24"/>
                 <w:szCs w:val="24"/>
               </w:rPr>
-              <w:t xml:space="preserve"/>
+              <w:t xml:space="preserve">1,A</w:t>
             </w:r>
           </w:p>
         </w:tc>
@@ -1504,7 +1504,7 @@
                 <w:sz w:val="24"/>
                 <w:szCs w:val="24"/>
               </w:rPr>
-              <w:t xml:space="preserve">X</w:t>
+              <w:t xml:space="preserve">2</w:t>
             </w:r>
           </w:p>
         </w:tc>
@@ -1523,7 +1523,7 @@
                 <w:sz w:val="24"/>
                 <w:szCs w:val="24"/>
               </w:rPr>
-              <w:t xml:space="preserve">X</w:t>
+              <w:t xml:space="preserve">2,A</w:t>
             </w:r>
           </w:p>
         </w:tc>
@@ -1698,7 +1698,7 @@
                 <w:sz w:val="24"/>
                 <w:szCs w:val="24"/>
               </w:rPr>
-              <w:t xml:space="preserve">X</w:t>
+              <w:t xml:space="preserve">3,A</w:t>
             </w:r>
           </w:p>
         </w:tc>
@@ -1763,7 +1763,7 @@
                 <w:sz w:val="24"/>
                 <w:szCs w:val="24"/>
               </w:rPr>
-              <w:t xml:space="preserve">3</w:t>
+              <w:t xml:space="preserve">3,A</w:t>
             </w:r>
           </w:p>
         </w:tc>
@@ -1784,7 +1784,7 @@
                 <w:sz w:val="24"/>
                 <w:szCs w:val="24"/>
               </w:rPr>
-              <w:t xml:space="preserve">3</w:t>
+              <w:t xml:space="preserve">3,A</w:t>
             </w:r>
           </w:p>
         </w:tc>
@@ -1847,7 +1847,7 @@
                 <w:sz w:val="24"/>
                 <w:szCs w:val="24"/>
               </w:rPr>
-              <w:t xml:space="preserve">2</w:t>
+              <w:t xml:space="preserve">2,A</w:t>
             </w:r>
           </w:p>
         </w:tc>
@@ -1868,7 +1868,7 @@
                 <w:sz w:val="24"/>
                 <w:szCs w:val="24"/>
               </w:rPr>
-              <w:t xml:space="preserve">3</w:t>
+              <w:t xml:space="preserve">3,A</w:t>
             </w:r>
           </w:p>
         </w:tc>

</xml_diff>

<commit_message>
v2.7: ma trận 3.2: ô CLO×PLO chỉ 1/2/3 (I/R/M), dòng Học phần 1/2/3 hoặc 3,A
Co-Authored-By: Claude Fable 5.1 <noreply@anthropic.com>
Claude-Session: https://claude.ai/code/session_01J5hFTnC5V9k15HPt9qZKTz
</commit_message>
<xml_diff>
--- a/tests/fixtures/chuan_en.docx
+++ b/tests/fixtures/chuan_en.docx
@@ -979,7 +979,7 @@
                 <w:sz w:val="24"/>
                 <w:szCs w:val="24"/>
               </w:rPr>
-              <w:t xml:space="preserve">3,A</w:t>
+              <w:t xml:space="preserve">3</w:t>
             </w:r>
           </w:p>
         </w:tc>
@@ -1154,7 +1154,7 @@
                 <w:sz w:val="24"/>
                 <w:szCs w:val="24"/>
               </w:rPr>
-              <w:t xml:space="preserve">3,A</w:t>
+              <w:t xml:space="preserve">3</w:t>
             </w:r>
           </w:p>
         </w:tc>
@@ -1523,7 +1523,7 @@
                 <w:sz w:val="24"/>
                 <w:szCs w:val="24"/>
               </w:rPr>
-              <w:t xml:space="preserve">2,A</w:t>
+              <w:t xml:space="preserve">2</w:t>
             </w:r>
           </w:p>
         </w:tc>
@@ -1698,7 +1698,7 @@
                 <w:sz w:val="24"/>
                 <w:szCs w:val="24"/>
               </w:rPr>
-              <w:t xml:space="preserve">3,A</w:t>
+              <w:t xml:space="preserve">3</w:t>
             </w:r>
           </w:p>
         </w:tc>
@@ -1847,7 +1847,7 @@
                 <w:sz w:val="24"/>
                 <w:szCs w:val="24"/>
               </w:rPr>
-              <w:t xml:space="preserve">2,A</w:t>
+              <w:t xml:space="preserve">2</w:t>
             </w:r>
           </w:p>
         </w:tc>

</xml_diff>

<commit_message>
v3.3: ba tiêu chí từ Hướng dẫn xây dựng CĐR (số CLO 3-6, CLO mở đầu bằng động từ hành động, mỗi CLO một PLO); chú thích sống ở form sinh file; ví dụ mẫu mỗi CLO một PLO; tests/make_chuan.py sinh fixture chuẩn tự động; 2 fixture mới
Co-Authored-By: Claude Fable 5.1 <noreply@anthropic.com>
Claude-Session: https://claude.ai/code/session_01AEuq31VSF44Wy4TPYsNuZa
</commit_message>
<xml_diff>
--- a/tests/fixtures/chuan_en.docx
+++ b/tests/fixtures/chuan_en.docx
@@ -229,7 +229,7 @@
           <w:sz w:val="26"/>
           <w:szCs w:val="26"/>
         </w:rPr>
-        <w:t xml:space="preserve"> None</w:t>
+        <w:t xml:space="preserve"> Không</w:t>
       </w:r>
     </w:p>
     <w:p>
@@ -444,7 +444,7 @@
                 <w:sz w:val="24"/>
                 <w:szCs w:val="24"/>
               </w:rPr>
-              <w:t xml:space="preserve">TS. Nguyễn Văn A</w:t>
+              <w:t xml:space="preserve">Dr. Nguyen Van A</w:t>
             </w:r>
           </w:p>
         </w:tc>
@@ -567,7 +567,7 @@
           <w:sz w:val="26"/>
           <w:szCs w:val="26"/>
         </w:rPr>
-        <w:t xml:space="preserve">Học phần cung cấp cho sinh viên những nguyên lý cơ bản của quản lý kinh tế ở cấp độ quốc gia: vì sao nhà nước can thiệp vào nền kinh tế, can thiệp bằng công cụ nào, và đánh giá kết quả can thiệp ra sao. Nội dung gồm bốn khối: bản chất và chức năng của quản lý kinh tế; các công cụ quản lý kinh tế vĩ mô; quản lý các thị trường và khu vực kinh tế; đánh giá hiệu lực và hiệu quả của chính sách kinh tế. Học phần kết hợp lý thuyết với các tình huống thực tế của Việt Nam để sinh viên vận dụng được khung phân tích vào các vấn đề quản lý kinh tế đương đại.</w:t>
+        <w:t xml:space="preserve">This course introduces the basic principles of economic management at the national level: why the state intervenes in the economy, which instruments it uses, and how the results of intervention are assessed. The content has four blocks: the nature and functions of economic management; macroeconomic management instruments; management of markets and economic sectors; and evaluation of the effectiveness and efficiency of economic policy. Theory is combined with Vietnamese cases so that students can apply the analytical framework to current economic management issues.</w:t>
       </w:r>
     </w:p>
     <w:p>
@@ -650,7 +650,7 @@
           <w:sz w:val="26"/>
           <w:szCs w:val="26"/>
         </w:rPr>
-        <w:t xml:space="preserve">- CLO1: Giải thích được bản chất, chức năng và các nguyên tắc của quản lý kinh tế.</w:t>
+        <w:t xml:space="preserve">- CLO1: Explain the nature, functions and principles of economic management.</w:t>
       </w:r>
     </w:p>
     <w:p>
@@ -663,7 +663,7 @@
           <w:sz w:val="26"/>
           <w:szCs w:val="26"/>
         </w:rPr>
-        <w:t xml:space="preserve">- CLO2: Phân tích được tác động của các công cụ quản lý kinh tế vĩ mô tới doanh nghiệp và hộ gia đình.</w:t>
+        <w:t xml:space="preserve">- CLO2: Analyze the effects of macroeconomic management instruments on firms and households.</w:t>
       </w:r>
     </w:p>
     <w:p>
@@ -676,7 +676,7 @@
           <w:sz w:val="26"/>
           <w:szCs w:val="26"/>
         </w:rPr>
-        <w:t xml:space="preserve">- CLO3: Vận dụng được khung phân tích chính sách vào một vấn đề quản lý kinh tế của Việt Nam.</w:t>
+        <w:t xml:space="preserve">- CLO3: Apply a policy analysis framework to a current economic management issue in Vietnam.</w:t>
       </w:r>
     </w:p>
     <w:p>
@@ -689,7 +689,7 @@
           <w:sz w:val="26"/>
           <w:szCs w:val="26"/>
         </w:rPr>
-        <w:t xml:space="preserve">- CLO4: Làm việc nhóm và trình bày kết quả phân tích một cách thuyết phục.</w:t>
+        <w:t xml:space="preserve">- CLO4: Work in teams and present analytical results persuasively.</w:t>
       </w:r>
     </w:p>
     <w:p>
@@ -702,7 +702,7 @@
           <w:sz w:val="26"/>
           <w:szCs w:val="26"/>
         </w:rPr>
-        <w:t xml:space="preserve">- CLO5: Tuân thủ chuẩn mực đạo đức nghề nghiệp và liêm chính học thuật.</w:t>
+        <w:t xml:space="preserve">- CLO5: Comply with professional ethics and academic integrity standards.</w:t>
       </w:r>
     </w:p>
     <w:p>
@@ -979,7 +979,7 @@
                 <w:sz w:val="24"/>
                 <w:szCs w:val="24"/>
               </w:rPr>
-              <w:t xml:space="preserve">3</w:t>
+              <w:t xml:space="preserve"/>
             </w:r>
           </w:p>
         </w:tc>
@@ -1154,7 +1154,7 @@
                 <w:sz w:val="24"/>
                 <w:szCs w:val="24"/>
               </w:rPr>
-              <w:t xml:space="preserve">3</w:t>
+              <w:t xml:space="preserve"/>
             </w:r>
           </w:p>
         </w:tc>
@@ -1329,7 +1329,7 @@
                 <w:sz w:val="24"/>
                 <w:szCs w:val="24"/>
               </w:rPr>
-              <w:t xml:space="preserve">2</w:t>
+              <w:t xml:space="preserve"/>
             </w:r>
           </w:p>
         </w:tc>
@@ -1523,7 +1523,7 @@
                 <w:sz w:val="24"/>
                 <w:szCs w:val="24"/>
               </w:rPr>
-              <w:t xml:space="preserve">2</w:t>
+              <w:t xml:space="preserve"/>
             </w:r>
           </w:p>
         </w:tc>
@@ -1805,7 +1805,7 @@
                 <w:sz w:val="24"/>
                 <w:szCs w:val="24"/>
               </w:rPr>
-              <w:t xml:space="preserve">2</w:t>
+              <w:t xml:space="preserve"/>
             </w:r>
           </w:p>
         </w:tc>
@@ -1847,7 +1847,7 @@
                 <w:sz w:val="24"/>
                 <w:szCs w:val="24"/>
               </w:rPr>
-              <w:t xml:space="preserve">2</w:t>
+              <w:t xml:space="preserve"/>
             </w:r>
           </w:p>
         </w:tc>
@@ -9611,7 +9611,7 @@
           <w:sz w:val="26"/>
           <w:szCs w:val="26"/>
         </w:rPr>
-        <w:t xml:space="preserve">- Đọc tài liệu trước mỗi buổi học và tham gia thảo luận.</w:t>
+        <w:t xml:space="preserve">- Read the assigned materials before each class and take part in discussions.</w:t>
       </w:r>
     </w:p>
     <w:p>
@@ -9624,7 +9624,7 @@
           <w:sz w:val="26"/>
           <w:szCs w:val="26"/>
         </w:rPr>
-        <w:t xml:space="preserve">- Nộp bài tập nhóm đúng hạn.</w:t>
+        <w:t xml:space="preserve">- Submit group assignments on time.</w:t>
       </w:r>
     </w:p>
     <w:p>
@@ -9692,7 +9692,7 @@
           <w:sz w:val="26"/>
           <w:szCs w:val="26"/>
         </w:rPr>
-        <w:t xml:space="preserve">- Sinh viên vắng quá 30% số buổi không được dự thi cuối kỳ.</w:t>
+        <w:t xml:space="preserve">- Students who miss more than 30% of the sessions are not allowed to sit the final examination.</w:t>
       </w:r>
     </w:p>
     <w:p>
@@ -9965,7 +9965,7 @@
                 <w:sz w:val="24"/>
                 <w:szCs w:val="24"/>
               </w:rPr>
-              <w:t xml:space="preserve">Formative</w:t>
+              <w:t xml:space="preserve">Formative assessment</w:t>
             </w:r>
           </w:p>
         </w:tc>
@@ -10003,7 +10003,7 @@
                 <w:sz w:val="24"/>
                 <w:szCs w:val="24"/>
               </w:rPr>
-              <w:t xml:space="preserve">Participation</w:t>
+              <w:t xml:space="preserve">Attendance and participation in discussions</w:t>
             </w:r>
           </w:p>
         </w:tc>
@@ -10022,7 +10022,7 @@
                 <w:sz w:val="24"/>
                 <w:szCs w:val="24"/>
               </w:rPr>
-              <w:t xml:space="preserve">Attendance record</w:t>
+              <w:t xml:space="preserve">Attendance records and observation</w:t>
             </w:r>
           </w:p>
         </w:tc>
@@ -10041,7 +10041,7 @@
                 <w:sz w:val="24"/>
                 <w:szCs w:val="24"/>
               </w:rPr>
-              <w:t xml:space="preserve">1, 2, 3</w:t>
+              <w:t xml:space="preserve">1, 2, 3, 4, 5</w:t>
             </w:r>
           </w:p>
         </w:tc>
@@ -10122,7 +10122,7 @@
                 <w:sz w:val="24"/>
                 <w:szCs w:val="24"/>
               </w:rPr>
-              <w:t xml:space="preserve">Written test or group report</w:t>
+              <w:t xml:space="preserve">Written test or group assignment with report</w:t>
             </w:r>
           </w:p>
         </w:tc>
@@ -10141,7 +10141,7 @@
                 <w:sz w:val="24"/>
                 <w:szCs w:val="24"/>
               </w:rPr>
-              <w:t xml:space="preserve">Rubric</w:t>
+              <w:t xml:space="preserve">In-class written test or group report graded by rubric</w:t>
             </w:r>
           </w:p>
         </w:tc>
@@ -10203,7 +10203,7 @@
                 <w:sz w:val="24"/>
                 <w:szCs w:val="24"/>
               </w:rPr>
-              <w:t xml:space="preserve">Summative</w:t>
+              <w:t xml:space="preserve">Summative assessment</w:t>
             </w:r>
           </w:p>
         </w:tc>
@@ -10222,7 +10222,7 @@
                 <w:sz w:val="24"/>
                 <w:szCs w:val="24"/>
               </w:rPr>
-              <w:t xml:space="preserve">Final exam</w:t>
+              <w:t xml:space="preserve">Final examination</w:t>
             </w:r>
           </w:p>
         </w:tc>
@@ -10260,7 +10260,7 @@
                 <w:sz w:val="24"/>
                 <w:szCs w:val="24"/>
               </w:rPr>
-              <w:t xml:space="preserve">Written or oral exam</w:t>
+              <w:t xml:space="preserve">Written or oral examination graded by rubric</w:t>
             </w:r>
           </w:p>
         </w:tc>

</xml_diff>